<commit_message>
docs: atualiza apostila de linguagem C
</commit_message>
<xml_diff>
--- a/docx/C/Apostila de Linguagem C.docx
+++ b/docx/C/Apostila de Linguagem C.docx
@@ -469,7 +469,7 @@
     </w:p>
     <w:sdt>
       <w:sdtPr>
-        <w:id w:val="-1273644139"/>
+        <w:id w:val="-1038165974"/>
         <w:docPartObj>
           <w:docPartGallery w:val="Table of Contents"/>
           <w:docPartUnique w:val="1"/>
@@ -1599,12 +1599,12 @@
           <wp:inline distB="0" distT="0" distL="0" distR="0">
             <wp:extent cx="6531898" cy="3186835"/>
             <wp:effectExtent b="0" l="0" r="0" t="0"/>
-            <wp:docPr descr="Interface gráfica do usuário, Texto, Aplicativo&#10;&#10;Descrição gerada automaticamente" id="11" name="image8.png"/>
+            <wp:docPr descr="Interface gráfica do usuário, Texto, Aplicativo&#10;&#10;Descrição gerada automaticamente" id="11" name="image19.png"/>
             <a:graphic>
               <a:graphicData uri="http://schemas.openxmlformats.org/drawingml/2006/picture">
                 <pic:pic>
                   <pic:nvPicPr>
-                    <pic:cNvPr descr="Interface gráfica do usuário, Texto, Aplicativo&#10;&#10;Descrição gerada automaticamente" id="0" name="image8.png"/>
+                    <pic:cNvPr descr="Interface gráfica do usuário, Texto, Aplicativo&#10;&#10;Descrição gerada automaticamente" id="0" name="image19.png"/>
                     <pic:cNvPicPr preferRelativeResize="0"/>
                   </pic:nvPicPr>
                   <pic:blipFill>
@@ -1706,12 +1706,12 @@
           <wp:inline distB="0" distT="0" distL="0" distR="0">
             <wp:extent cx="6883289" cy="2756877"/>
             <wp:effectExtent b="0" l="0" r="0" t="0"/>
-            <wp:docPr descr="Interface gráfica do usuário, Texto, Aplicativo&#10;&#10;Descrição gerada automaticamente" id="14" name="image30.png"/>
+            <wp:docPr descr="Interface gráfica do usuário, Texto, Aplicativo&#10;&#10;Descrição gerada automaticamente" id="14" name="image13.png"/>
             <a:graphic>
               <a:graphicData uri="http://schemas.openxmlformats.org/drawingml/2006/picture">
                 <pic:pic>
                   <pic:nvPicPr>
-                    <pic:cNvPr descr="Interface gráfica do usuário, Texto, Aplicativo&#10;&#10;Descrição gerada automaticamente" id="0" name="image30.png"/>
+                    <pic:cNvPr descr="Interface gráfica do usuário, Texto, Aplicativo&#10;&#10;Descrição gerada automaticamente" id="0" name="image13.png"/>
                     <pic:cNvPicPr preferRelativeResize="0"/>
                   </pic:nvPicPr>
                   <pic:blipFill>
@@ -1825,12 +1825,12 @@
           <wp:inline distB="0" distT="0" distL="0" distR="0">
             <wp:extent cx="6604489" cy="2072834"/>
             <wp:effectExtent b="0" l="0" r="0" t="0"/>
-            <wp:docPr descr="Texto, Linha do tempo&#10;&#10;Descrição gerada automaticamente" id="13" name="image6.png"/>
+            <wp:docPr descr="Texto, Linha do tempo&#10;&#10;Descrição gerada automaticamente" id="13" name="image12.png"/>
             <a:graphic>
               <a:graphicData uri="http://schemas.openxmlformats.org/drawingml/2006/picture">
                 <pic:pic>
                   <pic:nvPicPr>
-                    <pic:cNvPr descr="Texto, Linha do tempo&#10;&#10;Descrição gerada automaticamente" id="0" name="image6.png"/>
+                    <pic:cNvPr descr="Texto, Linha do tempo&#10;&#10;Descrição gerada automaticamente" id="0" name="image12.png"/>
                     <pic:cNvPicPr preferRelativeResize="0"/>
                   </pic:nvPicPr>
                   <pic:blipFill>
@@ -1998,12 +1998,12 @@
           <wp:inline distB="0" distT="0" distL="0" distR="0">
             <wp:extent cx="3241388" cy="864953"/>
             <wp:effectExtent b="0" l="0" r="0" t="0"/>
-            <wp:docPr descr="Texto&#10;&#10;Descrição gerada automaticamente" id="15" name="image15.png"/>
+            <wp:docPr descr="Texto&#10;&#10;Descrição gerada automaticamente" id="15" name="image23.png"/>
             <a:graphic>
               <a:graphicData uri="http://schemas.openxmlformats.org/drawingml/2006/picture">
                 <pic:pic>
                   <pic:nvPicPr>
-                    <pic:cNvPr descr="Texto&#10;&#10;Descrição gerada automaticamente" id="0" name="image15.png"/>
+                    <pic:cNvPr descr="Texto&#10;&#10;Descrição gerada automaticamente" id="0" name="image23.png"/>
                     <pic:cNvPicPr preferRelativeResize="0"/>
                   </pic:nvPicPr>
                   <pic:blipFill>
@@ -2084,12 +2084,12 @@
           <wp:inline distB="0" distT="0" distL="0" distR="0">
             <wp:extent cx="6985279" cy="1931137"/>
             <wp:effectExtent b="0" l="0" r="0" t="0"/>
-            <wp:docPr descr="Texto&#10;&#10;Descrição gerada automaticamente" id="18" name="image9.png"/>
+            <wp:docPr descr="Texto&#10;&#10;Descrição gerada automaticamente" id="18" name="image21.png"/>
             <a:graphic>
               <a:graphicData uri="http://schemas.openxmlformats.org/drawingml/2006/picture">
                 <pic:pic>
                   <pic:nvPicPr>
-                    <pic:cNvPr descr="Texto&#10;&#10;Descrição gerada automaticamente" id="0" name="image9.png"/>
+                    <pic:cNvPr descr="Texto&#10;&#10;Descrição gerada automaticamente" id="0" name="image21.png"/>
                     <pic:cNvPicPr preferRelativeResize="0"/>
                   </pic:nvPicPr>
                   <pic:blipFill>
@@ -2156,12 +2156,12 @@
           <wp:inline distB="0" distT="0" distL="0" distR="0">
             <wp:extent cx="971022" cy="2068699"/>
             <wp:effectExtent b="0" l="0" r="0" t="0"/>
-            <wp:docPr descr="Texto&#10;&#10;Descrição gerada automaticamente" id="17" name="image12.png"/>
+            <wp:docPr descr="Texto&#10;&#10;Descrição gerada automaticamente" id="17" name="image10.png"/>
             <a:graphic>
               <a:graphicData uri="http://schemas.openxmlformats.org/drawingml/2006/picture">
                 <pic:pic>
                   <pic:nvPicPr>
-                    <pic:cNvPr descr="Texto&#10;&#10;Descrição gerada automaticamente" id="0" name="image12.png"/>
+                    <pic:cNvPr descr="Texto&#10;&#10;Descrição gerada automaticamente" id="0" name="image10.png"/>
                     <pic:cNvPicPr preferRelativeResize="0"/>
                   </pic:nvPicPr>
                   <pic:blipFill>
@@ -2302,12 +2302,12 @@
           <wp:inline distB="0" distT="0" distL="0" distR="0">
             <wp:extent cx="6937096" cy="4064858"/>
             <wp:effectExtent b="0" l="0" r="0" t="0"/>
-            <wp:docPr descr="Texto&#10;&#10;Descrição gerada automaticamente com confiança média" id="22" name="image19.png"/>
+            <wp:docPr descr="Texto&#10;&#10;Descrição gerada automaticamente com confiança média" id="22" name="image22.png"/>
             <a:graphic>
               <a:graphicData uri="http://schemas.openxmlformats.org/drawingml/2006/picture">
                 <pic:pic>
                   <pic:nvPicPr>
-                    <pic:cNvPr descr="Texto&#10;&#10;Descrição gerada automaticamente com confiança média" id="0" name="image19.png"/>
+                    <pic:cNvPr descr="Texto&#10;&#10;Descrição gerada automaticamente com confiança média" id="0" name="image22.png"/>
                     <pic:cNvPicPr preferRelativeResize="0"/>
                   </pic:nvPicPr>
                   <pic:blipFill>
@@ -2378,12 +2378,12 @@
           <wp:inline distB="0" distT="0" distL="0" distR="0">
             <wp:extent cx="5006774" cy="1280271"/>
             <wp:effectExtent b="0" l="0" r="0" t="0"/>
-            <wp:docPr descr="Texto&#10;&#10;Descrição gerada automaticamente" id="20" name="image10.png"/>
+            <wp:docPr descr="Texto&#10;&#10;Descrição gerada automaticamente" id="20" name="image2.png"/>
             <a:graphic>
               <a:graphicData uri="http://schemas.openxmlformats.org/drawingml/2006/picture">
                 <pic:pic>
                   <pic:nvPicPr>
-                    <pic:cNvPr descr="Texto&#10;&#10;Descrição gerada automaticamente" id="0" name="image10.png"/>
+                    <pic:cNvPr descr="Texto&#10;&#10;Descrição gerada automaticamente" id="0" name="image2.png"/>
                     <pic:cNvPicPr preferRelativeResize="0"/>
                   </pic:nvPicPr>
                   <pic:blipFill>
@@ -2477,12 +2477,12 @@
           <wp:inline distB="0" distT="0" distL="0" distR="0">
             <wp:extent cx="7030403" cy="4427071"/>
             <wp:effectExtent b="0" l="0" r="0" t="0"/>
-            <wp:docPr descr="Texto&#10;&#10;Descrição gerada automaticamente" id="27" name="image35.png"/>
+            <wp:docPr descr="Texto&#10;&#10;Descrição gerada automaticamente" id="27" name="image32.png"/>
             <a:graphic>
               <a:graphicData uri="http://schemas.openxmlformats.org/drawingml/2006/picture">
                 <pic:pic>
                   <pic:nvPicPr>
-                    <pic:cNvPr descr="Texto&#10;&#10;Descrição gerada automaticamente" id="0" name="image35.png"/>
+                    <pic:cNvPr descr="Texto&#10;&#10;Descrição gerada automaticamente" id="0" name="image32.png"/>
                     <pic:cNvPicPr preferRelativeResize="0"/>
                   </pic:nvPicPr>
                   <pic:blipFill>
@@ -2552,12 +2552,12 @@
           <wp:inline distB="0" distT="0" distL="0" distR="0">
             <wp:extent cx="5288738" cy="1158340"/>
             <wp:effectExtent b="0" l="0" r="0" t="0"/>
-            <wp:docPr descr="Texto&#10;&#10;Descrição gerada automaticamente com confiança média" id="23" name="image20.png"/>
+            <wp:docPr descr="Texto&#10;&#10;Descrição gerada automaticamente com confiança média" id="23" name="image11.png"/>
             <a:graphic>
               <a:graphicData uri="http://schemas.openxmlformats.org/drawingml/2006/picture">
                 <pic:pic>
                   <pic:nvPicPr>
-                    <pic:cNvPr descr="Texto&#10;&#10;Descrição gerada automaticamente com confiança média" id="0" name="image20.png"/>
+                    <pic:cNvPr descr="Texto&#10;&#10;Descrição gerada automaticamente com confiança média" id="0" name="image11.png"/>
                     <pic:cNvPicPr preferRelativeResize="0"/>
                   </pic:nvPicPr>
                   <pic:blipFill>
@@ -2720,12 +2720,12 @@
           <wp:inline distB="0" distT="0" distL="0" distR="0">
             <wp:extent cx="6889439" cy="2611084"/>
             <wp:effectExtent b="0" l="0" r="0" t="0"/>
-            <wp:docPr descr="Texto&#10;&#10;Descrição gerada automaticamente" id="25" name="image36.png"/>
+            <wp:docPr descr="Texto&#10;&#10;Descrição gerada automaticamente" id="25" name="image17.png"/>
             <a:graphic>
               <a:graphicData uri="http://schemas.openxmlformats.org/drawingml/2006/picture">
                 <pic:pic>
                   <pic:nvPicPr>
-                    <pic:cNvPr descr="Texto&#10;&#10;Descrição gerada automaticamente" id="0" name="image36.png"/>
+                    <pic:cNvPr descr="Texto&#10;&#10;Descrição gerada automaticamente" id="0" name="image17.png"/>
                     <pic:cNvPicPr preferRelativeResize="0"/>
                   </pic:nvPicPr>
                   <pic:blipFill>
@@ -2806,12 +2806,12 @@
           <wp:inline distB="0" distT="0" distL="0" distR="0">
             <wp:extent cx="7011700" cy="3013613"/>
             <wp:effectExtent b="0" l="0" r="0" t="0"/>
-            <wp:docPr descr="Texto&#10;&#10;Descrição gerada automaticamente" id="28" name="image21.png"/>
+            <wp:docPr descr="Texto&#10;&#10;Descrição gerada automaticamente" id="28" name="image26.png"/>
             <a:graphic>
               <a:graphicData uri="http://schemas.openxmlformats.org/drawingml/2006/picture">
                 <pic:pic>
                   <pic:nvPicPr>
-                    <pic:cNvPr descr="Texto&#10;&#10;Descrição gerada automaticamente" id="0" name="image21.png"/>
+                    <pic:cNvPr descr="Texto&#10;&#10;Descrição gerada automaticamente" id="0" name="image26.png"/>
                     <pic:cNvPicPr preferRelativeResize="0"/>
                   </pic:nvPicPr>
                   <pic:blipFill>
@@ -2895,12 +2895,12 @@
           <wp:inline distB="0" distT="0" distL="0" distR="0">
             <wp:extent cx="6891626" cy="3037372"/>
             <wp:effectExtent b="0" l="0" r="0" t="0"/>
-            <wp:docPr descr="Texto&#10;&#10;Descrição gerada automaticamente" id="30" name="image22.png"/>
+            <wp:docPr descr="Texto&#10;&#10;Descrição gerada automaticamente" id="30" name="image35.png"/>
             <a:graphic>
               <a:graphicData uri="http://schemas.openxmlformats.org/drawingml/2006/picture">
                 <pic:pic>
                   <pic:nvPicPr>
-                    <pic:cNvPr descr="Texto&#10;&#10;Descrição gerada automaticamente" id="0" name="image22.png"/>
+                    <pic:cNvPr descr="Texto&#10;&#10;Descrição gerada automaticamente" id="0" name="image35.png"/>
                     <pic:cNvPicPr preferRelativeResize="0"/>
                   </pic:nvPicPr>
                   <pic:blipFill>
@@ -2957,12 +2957,12 @@
           <wp:inline distB="0" distT="0" distL="0" distR="0">
             <wp:extent cx="5400040" cy="4007049"/>
             <wp:effectExtent b="0" l="0" r="0" t="0"/>
-            <wp:docPr descr="Texto&#10;&#10;Descrição gerada automaticamente" id="32" name="image25.png"/>
+            <wp:docPr descr="Texto&#10;&#10;Descrição gerada automaticamente" id="32" name="image36.png"/>
             <a:graphic>
               <a:graphicData uri="http://schemas.openxmlformats.org/drawingml/2006/picture">
                 <pic:pic>
                   <pic:nvPicPr>
-                    <pic:cNvPr descr="Texto&#10;&#10;Descrição gerada automaticamente" id="0" name="image25.png"/>
+                    <pic:cNvPr descr="Texto&#10;&#10;Descrição gerada automaticamente" id="0" name="image36.png"/>
                     <pic:cNvPicPr preferRelativeResize="0"/>
                   </pic:nvPicPr>
                   <pic:blipFill>
@@ -3030,12 +3030,12 @@
           <wp:inline distB="0" distT="0" distL="0" distR="0">
             <wp:extent cx="1380935" cy="709046"/>
             <wp:effectExtent b="0" l="0" r="0" t="0"/>
-            <wp:docPr descr="Texto&#10;&#10;Descrição gerada automaticamente" id="34" name="image28.png"/>
+            <wp:docPr descr="Texto&#10;&#10;Descrição gerada automaticamente" id="34" name="image30.png"/>
             <a:graphic>
               <a:graphicData uri="http://schemas.openxmlformats.org/drawingml/2006/picture">
                 <pic:pic>
                   <pic:nvPicPr>
-                    <pic:cNvPr descr="Texto&#10;&#10;Descrição gerada automaticamente" id="0" name="image28.png"/>
+                    <pic:cNvPr descr="Texto&#10;&#10;Descrição gerada automaticamente" id="0" name="image30.png"/>
                     <pic:cNvPicPr preferRelativeResize="0"/>
                   </pic:nvPicPr>
                   <pic:blipFill>
@@ -3076,6 +3076,44 @@
       </w:pPr>
       <w:r>
         <w:rPr>
+          <w:rtl w:val="0"/>
+        </w:rPr>
+      </w:r>
+    </w:p>
+    <w:p>
+      <w:pPr>
+        <w:pStyle w:val="Heading2"/>
+        <w:rPr/>
+      </w:pPr>
+      <w:bookmarkStart w:colFirst="0" w:colLast="0" w:name="_bmio3gu6ydy1" w:id="6"/>
+      <w:bookmarkEnd w:id="6"/>
+      <w:r>
+        <w:rPr>
+          <w:rFonts w:ascii="Arial" w:cs="Arial" w:eastAsia="Arial" w:hAnsi="Arial"/>
+          <w:color w:val="000000"/>
+          <w:sz w:val="30"/>
+          <w:szCs w:val="30"/>
+          <w:rtl w:val="0"/>
+        </w:rPr>
+        <w:t xml:space="preserve">Funções com Passagem por Referência</w:t>
+      </w:r>
+      <w:r>
+        <w:rPr>
+          <w:rtl w:val="0"/>
+        </w:rPr>
+      </w:r>
+    </w:p>
+    <w:p>
+      <w:pPr>
+        <w:jc w:val="both"/>
+        <w:rPr>
+          <w:rFonts w:ascii="Arial" w:cs="Arial" w:eastAsia="Arial" w:hAnsi="Arial"/>
+          <w:sz w:val="24"/>
+          <w:szCs w:val="24"/>
+        </w:rPr>
+      </w:pPr>
+      <w:r>
+        <w:rPr>
           <w:rFonts w:ascii="Arial" w:cs="Arial" w:eastAsia="Arial" w:hAnsi="Arial"/>
           <w:sz w:val="24"/>
           <w:szCs w:val="24"/>
@@ -3153,12 +3191,12 @@
           <wp:inline distB="0" distT="0" distL="0" distR="0">
             <wp:extent cx="7172546" cy="1764460"/>
             <wp:effectExtent b="0" l="0" r="0" t="0"/>
-            <wp:docPr descr="Tela de celular com publicação numa rede social&#10;&#10;Descrição gerada automaticamente" id="36" name="image31.png"/>
+            <wp:docPr descr="Tela de celular com publicação numa rede social&#10;&#10;Descrição gerada automaticamente" id="36" name="image38.png"/>
             <a:graphic>
               <a:graphicData uri="http://schemas.openxmlformats.org/drawingml/2006/picture">
                 <pic:pic>
                   <pic:nvPicPr>
-                    <pic:cNvPr descr="Tela de celular com publicação numa rede social&#10;&#10;Descrição gerada automaticamente" id="0" name="image31.png"/>
+                    <pic:cNvPr descr="Tela de celular com publicação numa rede social&#10;&#10;Descrição gerada automaticamente" id="0" name="image38.png"/>
                     <pic:cNvPicPr preferRelativeResize="0"/>
                   </pic:nvPicPr>
                   <pic:blipFill>
@@ -3256,12 +3294,12 @@
           <wp:inline distB="0" distT="0" distL="0" distR="0">
             <wp:extent cx="5400040" cy="4007485"/>
             <wp:effectExtent b="0" l="0" r="0" t="0"/>
-            <wp:docPr descr="Texto&#10;&#10;Descrição gerada automaticamente" id="38" name="image25.png"/>
+            <wp:docPr descr="Texto&#10;&#10;Descrição gerada automaticamente" id="38" name="image36.png"/>
             <a:graphic>
               <a:graphicData uri="http://schemas.openxmlformats.org/drawingml/2006/picture">
                 <pic:pic>
                   <pic:nvPicPr>
-                    <pic:cNvPr descr="Texto&#10;&#10;Descrição gerada automaticamente" id="0" name="image25.png"/>
+                    <pic:cNvPr descr="Texto&#10;&#10;Descrição gerada automaticamente" id="0" name="image36.png"/>
                     <pic:cNvPicPr preferRelativeResize="0"/>
                   </pic:nvPicPr>
                   <pic:blipFill>
@@ -3346,12 +3384,12 @@
           <wp:inline distB="0" distT="0" distL="0" distR="0">
             <wp:extent cx="6891236" cy="2995063"/>
             <wp:effectExtent b="0" l="0" r="0" t="0"/>
-            <wp:docPr descr="Texto, Linha do tempo&#10;&#10;Descrição gerada automaticamente" id="39" name="image38.png"/>
+            <wp:docPr descr="Texto, Linha do tempo&#10;&#10;Descrição gerada automaticamente" id="39" name="image34.png"/>
             <a:graphic>
               <a:graphicData uri="http://schemas.openxmlformats.org/drawingml/2006/picture">
                 <pic:pic>
                   <pic:nvPicPr>
-                    <pic:cNvPr descr="Texto, Linha do tempo&#10;&#10;Descrição gerada automaticamente" id="0" name="image38.png"/>
+                    <pic:cNvPr descr="Texto, Linha do tempo&#10;&#10;Descrição gerada automaticamente" id="0" name="image34.png"/>
                     <pic:cNvPicPr preferRelativeResize="0"/>
                   </pic:nvPicPr>
                   <pic:blipFill>
@@ -3417,12 +3455,12 @@
           <wp:inline distB="0" distT="0" distL="0" distR="0">
             <wp:extent cx="621028" cy="671933"/>
             <wp:effectExtent b="0" l="0" r="0" t="0"/>
-            <wp:docPr descr="Uma imagem contendo Texto&#10;&#10;Descrição gerada automaticamente" id="40" name="image29.png"/>
+            <wp:docPr descr="Uma imagem contendo Texto&#10;&#10;Descrição gerada automaticamente" id="40" name="image39.png"/>
             <a:graphic>
               <a:graphicData uri="http://schemas.openxmlformats.org/drawingml/2006/picture">
                 <pic:pic>
                   <pic:nvPicPr>
-                    <pic:cNvPr descr="Uma imagem contendo Texto&#10;&#10;Descrição gerada automaticamente" id="0" name="image29.png"/>
+                    <pic:cNvPr descr="Uma imagem contendo Texto&#10;&#10;Descrição gerada automaticamente" id="0" name="image39.png"/>
                     <pic:cNvPicPr preferRelativeResize="0"/>
                   </pic:nvPicPr>
                   <pic:blipFill>
@@ -3507,8 +3545,8 @@
           <w:szCs w:val="30"/>
         </w:rPr>
       </w:pPr>
-      <w:bookmarkStart w:colFirst="0" w:colLast="0" w:name="_abrwp3xq1vhj" w:id="6"/>
-      <w:bookmarkEnd w:id="6"/>
+      <w:bookmarkStart w:colFirst="0" w:colLast="0" w:name="_abrwp3xq1vhj" w:id="7"/>
+      <w:bookmarkEnd w:id="7"/>
       <w:r>
         <w:rPr>
           <w:rFonts w:ascii="Arial" w:cs="Arial" w:eastAsia="Arial" w:hAnsi="Arial"/>
@@ -3556,12 +3594,12 @@
           <wp:inline distB="0" distT="0" distL="0" distR="0">
             <wp:extent cx="5400040" cy="1566545"/>
             <wp:effectExtent b="0" l="0" r="0" t="0"/>
-            <wp:docPr descr="Tela de celular com texto preto sobre fundo branco&#10;&#10;Descrição gerada automaticamente" id="1" name="image2.png"/>
+            <wp:docPr descr="Tela de celular com texto preto sobre fundo branco&#10;&#10;Descrição gerada automaticamente" id="1" name="image18.png"/>
             <a:graphic>
               <a:graphicData uri="http://schemas.openxmlformats.org/drawingml/2006/picture">
                 <pic:pic>
                   <pic:nvPicPr>
-                    <pic:cNvPr descr="Tela de celular com texto preto sobre fundo branco&#10;&#10;Descrição gerada automaticamente" id="0" name="image2.png"/>
+                    <pic:cNvPr descr="Tela de celular com texto preto sobre fundo branco&#10;&#10;Descrição gerada automaticamente" id="0" name="image18.png"/>
                     <pic:cNvPicPr preferRelativeResize="0"/>
                   </pic:nvPicPr>
                   <pic:blipFill>
@@ -3627,12 +3665,12 @@
           <wp:inline distB="0" distT="0" distL="0" distR="0">
             <wp:extent cx="3300181" cy="564470"/>
             <wp:effectExtent b="0" l="0" r="0" t="0"/>
-            <wp:docPr descr="Texto&#10;&#10;Descrição gerada automaticamente" id="2" name="image32.png"/>
+            <wp:docPr descr="Texto&#10;&#10;Descrição gerada automaticamente" id="2" name="image20.png"/>
             <a:graphic>
               <a:graphicData uri="http://schemas.openxmlformats.org/drawingml/2006/picture">
                 <pic:pic>
                   <pic:nvPicPr>
-                    <pic:cNvPr descr="Texto&#10;&#10;Descrição gerada automaticamente" id="0" name="image32.png"/>
+                    <pic:cNvPr descr="Texto&#10;&#10;Descrição gerada automaticamente" id="0" name="image20.png"/>
                     <pic:cNvPicPr preferRelativeResize="0"/>
                   </pic:nvPicPr>
                   <pic:blipFill>
@@ -3698,12 +3736,12 @@
           <wp:inline distB="0" distT="0" distL="0" distR="0">
             <wp:extent cx="5400040" cy="3095625"/>
             <wp:effectExtent b="0" l="0" r="0" t="0"/>
-            <wp:docPr descr="Interface gráfica do usuário, Texto&#10;&#10;Descrição gerada automaticamente" id="3" name="image3.png"/>
+            <wp:docPr descr="Interface gráfica do usuário, Texto&#10;&#10;Descrição gerada automaticamente" id="3" name="image1.png"/>
             <a:graphic>
               <a:graphicData uri="http://schemas.openxmlformats.org/drawingml/2006/picture">
                 <pic:pic>
                   <pic:nvPicPr>
-                    <pic:cNvPr descr="Interface gráfica do usuário, Texto&#10;&#10;Descrição gerada automaticamente" id="0" name="image3.png"/>
+                    <pic:cNvPr descr="Interface gráfica do usuário, Texto&#10;&#10;Descrição gerada automaticamente" id="0" name="image1.png"/>
                     <pic:cNvPicPr preferRelativeResize="0"/>
                   </pic:nvPicPr>
                   <pic:blipFill>
@@ -3769,12 +3807,12 @@
           <wp:inline distB="0" distT="0" distL="0" distR="0">
             <wp:extent cx="2804403" cy="746825"/>
             <wp:effectExtent b="0" l="0" r="0" t="0"/>
-            <wp:docPr descr="Interface gráfica do usuário, Texto&#10;&#10;Descrição gerada automaticamente" id="4" name="image1.png"/>
+            <wp:docPr descr="Interface gráfica do usuário, Texto&#10;&#10;Descrição gerada automaticamente" id="4" name="image5.png"/>
             <a:graphic>
               <a:graphicData uri="http://schemas.openxmlformats.org/drawingml/2006/picture">
                 <pic:pic>
                   <pic:nvPicPr>
-                    <pic:cNvPr descr="Interface gráfica do usuário, Texto&#10;&#10;Descrição gerada automaticamente" id="0" name="image1.png"/>
+                    <pic:cNvPr descr="Interface gráfica do usuário, Texto&#10;&#10;Descrição gerada automaticamente" id="0" name="image5.png"/>
                     <pic:cNvPicPr preferRelativeResize="0"/>
                   </pic:nvPicPr>
                   <pic:blipFill>
@@ -3857,12 +3895,12 @@
           <wp:inline distB="0" distT="0" distL="0" distR="0">
             <wp:extent cx="5400040" cy="1834515"/>
             <wp:effectExtent b="0" l="0" r="0" t="0"/>
-            <wp:docPr descr="Texto&#10;&#10;Descrição gerada automaticamente" id="5" name="image5.png"/>
+            <wp:docPr descr="Texto&#10;&#10;Descrição gerada automaticamente" id="5" name="image16.png"/>
             <a:graphic>
               <a:graphicData uri="http://schemas.openxmlformats.org/drawingml/2006/picture">
                 <pic:pic>
                   <pic:nvPicPr>
-                    <pic:cNvPr descr="Texto&#10;&#10;Descrição gerada automaticamente" id="0" name="image5.png"/>
+                    <pic:cNvPr descr="Texto&#10;&#10;Descrição gerada automaticamente" id="0" name="image16.png"/>
                     <pic:cNvPicPr preferRelativeResize="0"/>
                   </pic:nvPicPr>
                   <pic:blipFill>
@@ -3928,12 +3966,12 @@
           <wp:inline distB="0" distT="0" distL="0" distR="0">
             <wp:extent cx="3292125" cy="487722"/>
             <wp:effectExtent b="0" l="0" r="0" t="0"/>
-            <wp:docPr descr="Interface gráfica do usuário, Texto&#10;&#10;Descrição gerada automaticamente" id="6" name="image4.png"/>
+            <wp:docPr descr="Interface gráfica do usuário, Texto&#10;&#10;Descrição gerada automaticamente" id="6" name="image15.png"/>
             <a:graphic>
               <a:graphicData uri="http://schemas.openxmlformats.org/drawingml/2006/picture">
                 <pic:pic>
                   <pic:nvPicPr>
-                    <pic:cNvPr descr="Interface gráfica do usuário, Texto&#10;&#10;Descrição gerada automaticamente" id="0" name="image4.png"/>
+                    <pic:cNvPr descr="Interface gráfica do usuário, Texto&#10;&#10;Descrição gerada automaticamente" id="0" name="image15.png"/>
                     <pic:cNvPicPr preferRelativeResize="0"/>
                   </pic:nvPicPr>
                   <pic:blipFill>
@@ -4013,12 +4051,12 @@
           <wp:inline distB="0" distT="0" distL="0" distR="0">
             <wp:extent cx="5400040" cy="3117215"/>
             <wp:effectExtent b="0" l="0" r="0" t="0"/>
-            <wp:docPr descr="Texto, Carta&#10;&#10;Descrição gerada automaticamente" id="7" name="image27.png"/>
+            <wp:docPr descr="Texto, Carta&#10;&#10;Descrição gerada automaticamente" id="7" name="image8.png"/>
             <a:graphic>
               <a:graphicData uri="http://schemas.openxmlformats.org/drawingml/2006/picture">
                 <pic:pic>
                   <pic:nvPicPr>
-                    <pic:cNvPr descr="Texto, Carta&#10;&#10;Descrição gerada automaticamente" id="0" name="image27.png"/>
+                    <pic:cNvPr descr="Texto, Carta&#10;&#10;Descrição gerada automaticamente" id="0" name="image8.png"/>
                     <pic:cNvPicPr preferRelativeResize="0"/>
                   </pic:nvPicPr>
                   <pic:blipFill>
@@ -4084,12 +4122,12 @@
           <wp:inline distB="0" distT="0" distL="0" distR="0">
             <wp:extent cx="2926334" cy="845893"/>
             <wp:effectExtent b="0" l="0" r="0" t="0"/>
-            <wp:docPr descr="Texto&#10;&#10;Descrição gerada automaticamente" id="8" name="image14.png"/>
+            <wp:docPr descr="Texto&#10;&#10;Descrição gerada automaticamente" id="8" name="image6.png"/>
             <a:graphic>
               <a:graphicData uri="http://schemas.openxmlformats.org/drawingml/2006/picture">
                 <pic:pic>
                   <pic:nvPicPr>
-                    <pic:cNvPr descr="Texto&#10;&#10;Descrição gerada automaticamente" id="0" name="image14.png"/>
+                    <pic:cNvPr descr="Texto&#10;&#10;Descrição gerada automaticamente" id="0" name="image6.png"/>
                     <pic:cNvPicPr preferRelativeResize="0"/>
                   </pic:nvPicPr>
                   <pic:blipFill>
@@ -4190,12 +4228,12 @@
           <wp:inline distB="0" distT="0" distL="0" distR="0">
             <wp:extent cx="5400040" cy="3877945"/>
             <wp:effectExtent b="0" l="0" r="0" t="0"/>
-            <wp:docPr id="9" name="image13.png"/>
+            <wp:docPr id="9" name="image9.png"/>
             <a:graphic>
               <a:graphicData uri="http://schemas.openxmlformats.org/drawingml/2006/picture">
                 <pic:pic>
                   <pic:nvPicPr>
-                    <pic:cNvPr id="0" name="image13.png"/>
+                    <pic:cNvPr id="0" name="image9.png"/>
                     <pic:cNvPicPr preferRelativeResize="0"/>
                   </pic:nvPicPr>
                   <pic:blipFill>
@@ -4261,12 +4299,12 @@
           <wp:inline distB="0" distT="0" distL="0" distR="0">
             <wp:extent cx="2834886" cy="967824"/>
             <wp:effectExtent b="0" l="0" r="0" t="0"/>
-            <wp:docPr descr="Texto&#10;&#10;Descrição gerada automaticamente com confiança média" id="10" name="image26.png"/>
+            <wp:docPr descr="Texto&#10;&#10;Descrição gerada automaticamente com confiança média" id="10" name="image4.png"/>
             <a:graphic>
               <a:graphicData uri="http://schemas.openxmlformats.org/drawingml/2006/picture">
                 <pic:pic>
                   <pic:nvPicPr>
-                    <pic:cNvPr descr="Texto&#10;&#10;Descrição gerada automaticamente com confiança média" id="0" name="image26.png"/>
+                    <pic:cNvPr descr="Texto&#10;&#10;Descrição gerada automaticamente com confiança média" id="0" name="image4.png"/>
                     <pic:cNvPicPr preferRelativeResize="0"/>
                   </pic:nvPicPr>
                   <pic:blipFill>
@@ -4314,12 +4352,12 @@
           <wp:inline distB="0" distT="0" distL="0" distR="0">
             <wp:extent cx="2735817" cy="983065"/>
             <wp:effectExtent b="0" l="0" r="0" t="0"/>
-            <wp:docPr descr="Texto&#10;&#10;Descrição gerada automaticamente" id="19" name="image11.png"/>
+            <wp:docPr descr="Texto&#10;&#10;Descrição gerada automaticamente" id="19" name="image3.png"/>
             <a:graphic>
               <a:graphicData uri="http://schemas.openxmlformats.org/drawingml/2006/picture">
                 <pic:pic>
                   <pic:nvPicPr>
-                    <pic:cNvPr descr="Texto&#10;&#10;Descrição gerada automaticamente" id="0" name="image11.png"/>
+                    <pic:cNvPr descr="Texto&#10;&#10;Descrição gerada automaticamente" id="0" name="image3.png"/>
                     <pic:cNvPicPr preferRelativeResize="0"/>
                   </pic:nvPicPr>
                   <pic:blipFill>
@@ -4438,12 +4476,12 @@
           <wp:inline distB="0" distT="0" distL="0" distR="0">
             <wp:extent cx="5400040" cy="3328670"/>
             <wp:effectExtent b="0" l="0" r="0" t="0"/>
-            <wp:docPr descr="Interface gráfica do usuário, Texto, Aplicativo&#10;&#10;Descrição gerada automaticamente" id="21" name="image16.png"/>
+            <wp:docPr descr="Interface gráfica do usuário, Texto, Aplicativo&#10;&#10;Descrição gerada automaticamente" id="21" name="image14.png"/>
             <a:graphic>
               <a:graphicData uri="http://schemas.openxmlformats.org/drawingml/2006/picture">
                 <pic:pic>
                   <pic:nvPicPr>
-                    <pic:cNvPr descr="Interface gráfica do usuário, Texto, Aplicativo&#10;&#10;Descrição gerada automaticamente" id="0" name="image16.png"/>
+                    <pic:cNvPr descr="Interface gráfica do usuário, Texto, Aplicativo&#10;&#10;Descrição gerada automaticamente" id="0" name="image14.png"/>
                     <pic:cNvPicPr preferRelativeResize="0"/>
                   </pic:nvPicPr>
                   <pic:blipFill>
@@ -4509,12 +4547,12 @@
           <wp:inline distB="0" distT="0" distL="0" distR="0">
             <wp:extent cx="2766300" cy="975445"/>
             <wp:effectExtent b="0" l="0" r="0" t="0"/>
-            <wp:docPr descr="Interface gráfica do usuário, Texto, Aplicativo&#10;&#10;Descrição gerada automaticamente" id="24" name="image34.png"/>
+            <wp:docPr descr="Interface gráfica do usuário, Texto, Aplicativo&#10;&#10;Descrição gerada automaticamente" id="24" name="image27.png"/>
             <a:graphic>
               <a:graphicData uri="http://schemas.openxmlformats.org/drawingml/2006/picture">
                 <pic:pic>
                   <pic:nvPicPr>
-                    <pic:cNvPr descr="Interface gráfica do usuário, Texto, Aplicativo&#10;&#10;Descrição gerada automaticamente" id="0" name="image34.png"/>
+                    <pic:cNvPr descr="Interface gráfica do usuário, Texto, Aplicativo&#10;&#10;Descrição gerada automaticamente" id="0" name="image27.png"/>
                     <pic:cNvPicPr preferRelativeResize="0"/>
                   </pic:nvPicPr>
                   <pic:blipFill>
@@ -4624,12 +4662,12 @@
           <wp:inline distB="0" distT="0" distL="0" distR="0">
             <wp:extent cx="5400040" cy="3390900"/>
             <wp:effectExtent b="0" l="0" r="0" t="0"/>
-            <wp:docPr descr="Interface gráfica do usuário, Texto, Aplicativo&#10;&#10;Descrição gerada automaticamente" id="26" name="image18.png"/>
+            <wp:docPr descr="Interface gráfica do usuário, Texto, Aplicativo&#10;&#10;Descrição gerada automaticamente" id="26" name="image24.png"/>
             <a:graphic>
               <a:graphicData uri="http://schemas.openxmlformats.org/drawingml/2006/picture">
                 <pic:pic>
                   <pic:nvPicPr>
-                    <pic:cNvPr descr="Interface gráfica do usuário, Texto, Aplicativo&#10;&#10;Descrição gerada automaticamente" id="0" name="image18.png"/>
+                    <pic:cNvPr descr="Interface gráfica do usuário, Texto, Aplicativo&#10;&#10;Descrição gerada automaticamente" id="0" name="image24.png"/>
                     <pic:cNvPicPr preferRelativeResize="0"/>
                   </pic:nvPicPr>
                   <pic:blipFill>
@@ -4709,12 +4747,12 @@
           <wp:inline distB="0" distT="0" distL="0" distR="0">
             <wp:extent cx="3200677" cy="807790"/>
             <wp:effectExtent b="0" l="0" r="0" t="0"/>
-            <wp:docPr descr="Texto&#10;&#10;Descrição gerada automaticamente" id="29" name="image17.png"/>
+            <wp:docPr descr="Texto&#10;&#10;Descrição gerada automaticamente" id="29" name="image31.png"/>
             <a:graphic>
               <a:graphicData uri="http://schemas.openxmlformats.org/drawingml/2006/picture">
                 <pic:pic>
                   <pic:nvPicPr>
-                    <pic:cNvPr descr="Texto&#10;&#10;Descrição gerada automaticamente" id="0" name="image17.png"/>
+                    <pic:cNvPr descr="Texto&#10;&#10;Descrição gerada automaticamente" id="0" name="image31.png"/>
                     <pic:cNvPicPr preferRelativeResize="0"/>
                   </pic:nvPicPr>
                   <pic:blipFill>
@@ -4762,12 +4800,12 @@
           <wp:inline distB="0" distT="0" distL="0" distR="0">
             <wp:extent cx="3147333" cy="777307"/>
             <wp:effectExtent b="0" l="0" r="0" t="0"/>
-            <wp:docPr descr="Interface gráfica do usuário, Texto&#10;&#10;Descrição gerada automaticamente" id="31" name="image24.png"/>
+            <wp:docPr descr="Interface gráfica do usuário, Texto&#10;&#10;Descrição gerada automaticamente" id="31" name="image29.png"/>
             <a:graphic>
               <a:graphicData uri="http://schemas.openxmlformats.org/drawingml/2006/picture">
                 <pic:pic>
                   <pic:nvPicPr>
-                    <pic:cNvPr descr="Interface gráfica do usuário, Texto&#10;&#10;Descrição gerada automaticamente" id="0" name="image24.png"/>
+                    <pic:cNvPr descr="Interface gráfica do usuário, Texto&#10;&#10;Descrição gerada automaticamente" id="0" name="image29.png"/>
                     <pic:cNvPicPr preferRelativeResize="0"/>
                   </pic:nvPicPr>
                   <pic:blipFill>
@@ -4868,12 +4906,12 @@
           <wp:inline distB="0" distT="0" distL="0" distR="0">
             <wp:extent cx="5400040" cy="2305685"/>
             <wp:effectExtent b="0" l="0" r="0" t="0"/>
-            <wp:docPr descr="Texto&#10;&#10;Descrição gerada automaticamente" id="33" name="image23.png"/>
+            <wp:docPr descr="Texto&#10;&#10;Descrição gerada automaticamente" id="33" name="image28.png"/>
             <a:graphic>
               <a:graphicData uri="http://schemas.openxmlformats.org/drawingml/2006/picture">
                 <pic:pic>
                   <pic:nvPicPr>
-                    <pic:cNvPr descr="Texto&#10;&#10;Descrição gerada automaticamente" id="0" name="image23.png"/>
+                    <pic:cNvPr descr="Texto&#10;&#10;Descrição gerada automaticamente" id="0" name="image28.png"/>
                     <pic:cNvPicPr preferRelativeResize="0"/>
                   </pic:nvPicPr>
                   <pic:blipFill>
@@ -4939,12 +4977,12 @@
           <wp:inline distB="0" distT="0" distL="0" distR="0">
             <wp:extent cx="3467400" cy="579170"/>
             <wp:effectExtent b="0" l="0" r="0" t="0"/>
-            <wp:docPr descr="Texto&#10;&#10;Descrição gerada automaticamente" id="35" name="image37.png"/>
+            <wp:docPr descr="Texto&#10;&#10;Descrição gerada automaticamente" id="35" name="image33.png"/>
             <a:graphic>
               <a:graphicData uri="http://schemas.openxmlformats.org/drawingml/2006/picture">
                 <pic:pic>
                   <pic:nvPicPr>
-                    <pic:cNvPr descr="Texto&#10;&#10;Descrição gerada automaticamente" id="0" name="image37.png"/>
+                    <pic:cNvPr descr="Texto&#10;&#10;Descrição gerada automaticamente" id="0" name="image33.png"/>
                     <pic:cNvPicPr preferRelativeResize="0"/>
                   </pic:nvPicPr>
                   <pic:blipFill>
@@ -5002,8 +5040,8 @@
           <w:szCs w:val="30"/>
         </w:rPr>
       </w:pPr>
-      <w:bookmarkStart w:colFirst="0" w:colLast="0" w:name="_eoryv1pw90cw" w:id="7"/>
-      <w:bookmarkEnd w:id="7"/>
+      <w:bookmarkStart w:colFirst="0" w:colLast="0" w:name="_eoryv1pw90cw" w:id="8"/>
+      <w:bookmarkEnd w:id="8"/>
       <w:r>
         <w:rPr>
           <w:rFonts w:ascii="Arial" w:cs="Arial" w:eastAsia="Arial" w:hAnsi="Arial"/>
@@ -5169,8 +5207,8 @@
           <w:szCs w:val="30"/>
         </w:rPr>
       </w:pPr>
-      <w:bookmarkStart w:colFirst="0" w:colLast="0" w:name="_78eu6bb3bpdh" w:id="8"/>
-      <w:bookmarkEnd w:id="8"/>
+      <w:bookmarkStart w:colFirst="0" w:colLast="0" w:name="_78eu6bb3bpdh" w:id="9"/>
+      <w:bookmarkEnd w:id="9"/>
       <w:r>
         <w:rPr>
           <w:rFonts w:ascii="Arial" w:cs="Arial" w:eastAsia="Arial" w:hAnsi="Arial"/>
@@ -5247,8 +5285,8 @@
           <w:szCs w:val="30"/>
         </w:rPr>
       </w:pPr>
-      <w:bookmarkStart w:colFirst="0" w:colLast="0" w:name="_44v328b93glx" w:id="9"/>
-      <w:bookmarkEnd w:id="9"/>
+      <w:bookmarkStart w:colFirst="0" w:colLast="0" w:name="_44v328b93glx" w:id="10"/>
+      <w:bookmarkEnd w:id="10"/>
       <w:r>
         <w:rPr>
           <w:rFonts w:ascii="Arial" w:cs="Arial" w:eastAsia="Arial" w:hAnsi="Arial"/>
@@ -5312,12 +5350,12 @@
           <wp:inline distB="0" distT="0" distL="0" distR="0">
             <wp:extent cx="7290452" cy="1486552"/>
             <wp:effectExtent b="0" l="0" r="0" t="0"/>
-            <wp:docPr id="37" name="image33.png"/>
+            <wp:docPr id="37" name="image37.png"/>
             <a:graphic>
               <a:graphicData uri="http://schemas.openxmlformats.org/drawingml/2006/picture">
                 <pic:pic>
                   <pic:nvPicPr>
-                    <pic:cNvPr id="0" name="image33.png"/>
+                    <pic:cNvPr id="0" name="image37.png"/>
                     <pic:cNvPicPr preferRelativeResize="0"/>
                   </pic:nvPicPr>
                   <pic:blipFill>
@@ -5411,8 +5449,8 @@
           <w:szCs w:val="30"/>
         </w:rPr>
       </w:pPr>
-      <w:bookmarkStart w:colFirst="0" w:colLast="0" w:name="_rf1983gn9efs" w:id="10"/>
-      <w:bookmarkEnd w:id="10"/>
+      <w:bookmarkStart w:colFirst="0" w:colLast="0" w:name="_rf1983gn9efs" w:id="11"/>
+      <w:bookmarkEnd w:id="11"/>
       <w:r>
         <w:rPr>
           <w:rFonts w:ascii="Arial" w:cs="Arial" w:eastAsia="Arial" w:hAnsi="Arial"/>
@@ -5448,20 +5486,20 @@
         <w:pStyle w:val="Heading2"/>
         <w:rPr/>
       </w:pPr>
-      <w:bookmarkStart w:colFirst="0" w:colLast="0" w:name="_tfrpwcg73jae" w:id="11"/>
-      <w:bookmarkEnd w:id="11"/>
+      <w:bookmarkStart w:colFirst="0" w:colLast="0" w:name="_tfrpwcg73jae" w:id="12"/>
+      <w:bookmarkEnd w:id="12"/>
       <w:r>
         <w:rPr/>
         <w:drawing>
           <wp:inline distB="114300" distT="114300" distL="114300" distR="114300">
             <wp:extent cx="4933950" cy="7981950"/>
             <wp:effectExtent b="0" l="0" r="0" t="0"/>
-            <wp:docPr id="12" name="image39.png"/>
+            <wp:docPr id="12" name="image25.png"/>
             <a:graphic>
               <a:graphicData uri="http://schemas.openxmlformats.org/drawingml/2006/picture">
                 <pic:pic>
                   <pic:nvPicPr>
-                    <pic:cNvPr id="0" name="image39.png"/>
+                    <pic:cNvPr id="0" name="image25.png"/>
                     <pic:cNvPicPr preferRelativeResize="0"/>
                   </pic:nvPicPr>
                   <pic:blipFill>
@@ -5522,8 +5560,8 @@
           <w:szCs w:val="30"/>
         </w:rPr>
       </w:pPr>
-      <w:bookmarkStart w:colFirst="0" w:colLast="0" w:name="_ckahys6cenvg" w:id="12"/>
-      <w:bookmarkEnd w:id="12"/>
+      <w:bookmarkStart w:colFirst="0" w:colLast="0" w:name="_ckahys6cenvg" w:id="13"/>
+      <w:bookmarkEnd w:id="13"/>
       <w:r>
         <w:rPr>
           <w:rFonts w:ascii="Arial" w:cs="Arial" w:eastAsia="Arial" w:hAnsi="Arial"/>

</xml_diff>